<commit_message>
Remove notes about formatting and generation from the document.
The reference list, the backlog appendix and section 1.2 no longer explain how they are styled or built; the document keeps only its content.

Co-Authored-By: Claude Opus 5.5 <noreply@anthropic.com>
</commit_message>
<xml_diff>
--- a/wireframes/BA_Kalashnikov_Kirill.docx
+++ b/wireframes/BA_Kalashnikov_Kirill.docx
@@ -472,7 +472,7 @@
             <w:tab/>
           </w:r>
           <w:r>
-            <w:t>31</w:t>
+            <w:t>30</w:t>
           </w:r>
         </w:p>
         <w:p>
@@ -486,7 +486,7 @@
             <w:tab/>
           </w:r>
           <w:r>
-            <w:t>34</w:t>
+            <w:t>33</w:t>
           </w:r>
         </w:p>
         <w:p>
@@ -500,7 +500,7 @@
             <w:tab/>
           </w:r>
           <w:r>
-            <w:t>40</w:t>
+            <w:t>39</w:t>
           </w:r>
         </w:p>
         <w:p>
@@ -514,7 +514,7 @@
             <w:tab/>
           </w:r>
           <w:r>
-            <w:t>40</w:t>
+            <w:t>39</w:t>
           </w:r>
         </w:p>
         <!--/toc-->
@@ -2096,7 +2096,7 @@
         <w:jc w:val="both"/>
       </w:pPr>
       <w:r>
-        <w:t xml:space="preserve">Использованы 24 источника, из них 9 научных. Ссылки оформлены по Чикагскому стилю (сноски и библиография, 16-е изд.). Источники разбиты на четыре группы: методы реконструкции, представление сцены, стандарты и правила, рынок и аналоги.</w:t>
+        <w:t xml:space="preserve">Использованы 24 источника, из них 9 научных. Источники разбиты на четыре группы: методы реконструкции, представление сцены, стандарты и правила, рынок и аналоги.</w:t>
       </w:r>
     </w:p>
     <w:p>
@@ -26229,16 +26229,6 @@
     </w:p>
     <w:p>
       <w:pPr>
-        <w:keepNext w:val="false"/>
-        <w:ind w:firstLine="709"/>
-        <w:jc w:val="both"/>
-      </w:pPr>
-      <w:r>
-        <w:t xml:space="preserve">Источники расположены в алфавитном порядке и оформлены по Чикагскому стилю (метод сносок и библиографии, 16-е изд.). Источников на кириллице нет. Ссылки в тексте даны постраничными сносками.</w:t>
-      </w:r>
-    </w:p>
-    <w:p>
-      <w:pPr>
         <w:pStyle w:val="ListParagraph"/>
         <w:numPr>
           <w:ilvl w:val="0"/>
@@ -26250,7 +26240,7 @@
       <w:r>
         <w:t xml:space="preserve">Apple Inc. “Models with a LiDAR Scanner.” Apple Support. Accessed October 19, 2026. </w:t>
       </w:r>
-      <w:hyperlink w:history="1" r:id="rIdweowulhxyjmecrvkikkv8">
+      <w:hyperlink w:history="1" r:id="rIdaqac7qxrff4t-zdepdwap">
         <w:r>
           <w:rPr>
             <w:color w:val="0F5C55"/>
@@ -26275,7 +26265,7 @@
       <w:r>
         <w:t xml:space="preserve">Apple Inc. “RoomPlan.” Apple Developer. Accessed October 19, 2026. </w:t>
       </w:r>
-      <w:hyperlink w:history="1" r:id="rId9s6_tkf6vj5wnesvgo_53">
+      <w:hyperlink w:history="1" r:id="rIdx7l2atdbv7ps9nspcxzn8">
         <w:r>
           <w:rPr>
             <w:color w:val="0F5C55"/>
@@ -26324,7 +26314,7 @@
       <w:r>
         <w:t xml:space="preserve">Epic Games. “Epic Games Releases Free RealityScan iOS App for 3D Scanning.” December 2022. Accessed October 19, 2026. </w:t>
       </w:r>
-      <w:hyperlink w:history="1" r:id="rIdr-ggjqn_c9ooclv26m2fm">
+      <w:hyperlink w:history="1" r:id="rIdqostqsjbx-rrdnndebfso">
         <w:r>
           <w:rPr>
             <w:color w:val="0F5C55"/>
@@ -26349,7 +26339,7 @@
       <w:r>
         <w:t xml:space="preserve">Epic Games. “Fortnite Ecosystem 2024 Year in Review: Celebrating Creators and Looking Ahead.” January 22, 2025. Accessed October 19, 2026. </w:t>
       </w:r>
-      <w:hyperlink w:history="1" r:id="rIdiy8gqy8yfnszae6rtqcfn">
+      <w:hyperlink w:history="1" r:id="rIdq6kva190pcgnfc76zux3g">
         <w:r>
           <w:rPr>
             <w:color w:val="0F5C55"/>
@@ -26470,7 +26460,7 @@
       <w:r>
         <w:t xml:space="preserve">Khronos Group. “glTF 2.0 Specification.” 2021. Accessed October 19, 2026. </w:t>
       </w:r>
-      <w:hyperlink w:history="1" r:id="rIdcwax3rmq9w3p4bw8hx0ie">
+      <w:hyperlink w:history="1" r:id="rIdedkd7uanpfny31gbqpksg">
         <w:r>
           <w:rPr>
             <w:color w:val="0F5C55"/>
@@ -26495,7 +26485,7 @@
       <w:r>
         <w:t xml:space="preserve">KIRI Innovations. “KIRI Engine Pricing.” Accessed October 19, 2026. </w:t>
       </w:r>
-      <w:hyperlink w:history="1" r:id="rId1-nkzjwhjrxauu54g3mne">
+      <w:hyperlink w:history="1" r:id="rId5hpe2aqgyaxyh0nqidcfz">
         <w:r>
           <w:rPr>
             <w:color w:val="0F5C55"/>
@@ -26568,7 +26558,7 @@
       <w:r>
         <w:t xml:space="preserve">Luma AI. “Luma Unreal Engine Plugin.” Documentation. Accessed October 19, 2026. </w:t>
       </w:r>
-      <w:hyperlink w:history="1" r:id="rId2opc7vvoiulnyjgixygjr">
+      <w:hyperlink w:history="1" r:id="rIdkupdftxehgaqatlrf4nha">
         <w:r>
           <w:rPr>
             <w:color w:val="0F5C55"/>
@@ -26593,7 +26583,7 @@
       <w:r>
         <w:t xml:space="preserve">MP1st. “Over 18,000 Games Released on Steam in 2025, but Half Have Fewer Than 10 Reviews.” 2026. Accessed October 19, 2026. </w:t>
       </w:r>
-      <w:hyperlink w:history="1" r:id="rIdgwvggctujdwvtxuem1cpy">
+      <w:hyperlink w:history="1" r:id="rIdul3lbsdi1mvzgcl-inyni">
         <w:r>
           <w:rPr>
             <w:color w:val="0F5C55"/>
@@ -26642,7 +26632,7 @@
       <w:r>
         <w:t xml:space="preserve">Niantic Spatial. “Scaniverse – 3D Scanner.” App Store. Accessed October 19, 2026. </w:t>
       </w:r>
-      <w:hyperlink w:history="1" r:id="rIdp8xzhsuk5nff0rnbx3tzr">
+      <w:hyperlink w:history="1" r:id="rIdbzl2pmzsds0ne70cfbufm">
         <w:r>
           <w:rPr>
             <w:color w:val="0F5C55"/>
@@ -26667,7 +26657,7 @@
       <w:r>
         <w:t xml:space="preserve">Polycam. “Export Gaussian Splats from Polycam to Unreal Engine.” Help Center. Accessed October 19, 2026. </w:t>
       </w:r>
-      <w:hyperlink w:history="1" r:id="rIdp9b93peh903kqaznz9jjd">
+      <w:hyperlink w:history="1" r:id="rIdwp8hrseuo09npwfoy5pff">
         <w:r>
           <w:rPr>
             <w:color w:val="0F5C55"/>
@@ -26692,7 +26682,7 @@
       <w:r>
         <w:t xml:space="preserve">Roblox Corporation. “Form 10-K for the Fiscal Year Ended December 31, 2025.” U.S. Securities and Exchange Commission, 2026. Accessed October 19, 2026. </w:t>
       </w:r>
-      <w:hyperlink w:history="1" r:id="rIdla46w7kdea4miebg3rrxw">
+      <w:hyperlink w:history="1" r:id="rId-ry_wiuqy86rmno4ftsdx">
         <w:r>
           <w:rPr>
             <w:color w:val="0F5C55"/>
@@ -26717,7 +26707,7 @@
       <w:r>
         <w:t xml:space="preserve">W3C. “Web Content Accessibility Guidelines (WCAG) 2.1.” W3C Recommendation, June 5, 2018. Accessed October 19, 2026. </w:t>
       </w:r>
-      <w:hyperlink w:history="1" r:id="rId0oxsmn0v7lesirseiwkt1">
+      <w:hyperlink w:history="1" r:id="rIdkxrsllhspit8v0qy0df3j">
         <w:r>
           <w:rPr>
             <w:color w:val="0F5C55"/>
@@ -26742,7 +26732,7 @@
       <w:r>
         <w:t xml:space="preserve">World Labs. “Marble: Export Mesh.” Documentation. Accessed October 19, 2026. </w:t>
       </w:r>
-      <w:hyperlink w:history="1" r:id="rId1ir8g6ocsozlbl3aqbjyd">
+      <w:hyperlink w:history="1" r:id="rIdra4bqqcz1_03njkfdhkdw">
         <w:r>
           <w:rPr>
             <w:color w:val="0F5C55"/>
@@ -26848,7 +26838,7 @@
         <w:jc w:val="both"/>
       </w:pPr>
       <w:r>
-        <w:t xml:space="preserve">Полная таблица эпиков и историй приведена в табл. П.1.1. Она собирается автоматически из раздела 2.5, поэтому совпадает с ним дословно.</w:t>
+        <w:t xml:space="preserve">Полная таблица эпиков и историй приведена в табл. П.1.1.</w:t>
       </w:r>
     </w:p>
     <w:p>

</xml_diff>